<commit_message>
vault backup: 2026-05-06 21:35:30
</commit_message>
<xml_diff>
--- a/学校事务/大数据/课程总结/12303070250黄彬.docx
+++ b/学校事务/大数据/课程总结/12303070250黄彬.docx
@@ -478,7 +478,7 @@
           <w:b/>
           <w:sz w:val="24"/>
         </w:rPr>
-        <w:t>一、我对大数据技术的理解</w:t>
+        <w:t>一、对大数据技术的理解</w:t>
       </w:r>
     </w:p>
     <w:p>
@@ -492,7 +492,7 @@
           <w:b w:val="0"/>
           <w:sz w:val="24"/>
         </w:rPr>
-        <w:t>刚开始上这门课的时候，我其实把“大数据”想得有点简单，觉得它大概就是数据很多、电脑跑得久一点。学到后面才发现，这个理解只摸到了一层皮。真正的大数据处理，麻烦的地方不只是数据量大，而是数据来源杂、格式不统一、里面还有缺失值和异常值。要想让这些数据真的能被使用，前面必须经过采集、存储、清洗、计算、分析这些环节，少一步都会影响后面的结果。</w:t>
+        <w:t>这门课刚开始的时候，我对大数据的理解其实挺模糊。听到“大数据”三个字，第一反应就是数据特别多，可能电脑配置要好一点，程序跑得久一点。后来学到数据采集、存储、清洗和计算这些内容，我才发现它不是简单把很多数据放在一起。真正麻烦的地方，是数据又多又乱，而且很多时候并不是拿来就能用。</w:t>
       </w:r>
     </w:p>
     <w:p>
@@ -506,7 +506,7 @@
           <w:b w:val="0"/>
           <w:sz w:val="24"/>
         </w:rPr>
-        <w:t>我印象比较深的是分布式处理的思想。以前做普通程序时，我习惯把任务看成一台电脑上的事情；但在大数据场景里，单台机器很快就会遇到存储和计算能力的限制。HDFS、MapReduce 这些内容让我明白，很多大任务并不是靠一台机器“硬撑”，而是把数据和任务拆开，让多台机器一起完成。这个思路对我挺有启发，因为它不仅是技术方案，也像是一种解决复杂问题的方法：先拆清楚，再分头处理，最后汇总。</w:t>
+        <w:t>比如一份表里，字段名可能不统一，有的地方空着，有的记录重复，还有一些值看起来就不太合理。以前我看到这种情况，会想着先把代码写出来再说。但现在回头看，如果前面没处理好，后面算出来的结果很可能是偏的。课堂上讲到数据预处理时，我一开始觉得这一块有点琐碎，后来做练习才发现，它反而是最容易出问题的地方。</w:t>
       </w:r>
     </w:p>
     <w:p>
@@ -520,20 +520,7 @@
           <w:b w:val="0"/>
           <w:sz w:val="24"/>
         </w:rPr>
-        <w:t>还有一点是，我以前对数据清洗的重视不够。课程实践里，只要字段格式有一点不一致，或者路径、编码、空值没有处理好，后面的统计结果就可能变得很奇怪。有时候代码没有报错，但结果不一定就是对的。这个过程让我意识到，大数据并不是把工具打开、代码跑通就结束了，真正费时间的往往是前期检查和整理。数据质量如果不可靠，后面再漂亮的图表也只是表面好看。</w:t>
-      </w:r>
-    </w:p>
-    <w:p>
-      <w:pPr>
-        <w:spacing w:line="360" w:lineRule="auto" w:before="160" w:after="40"/>
-      </w:pPr>
-      <w:r>
-        <w:rPr>
-          <w:rFonts w:ascii="宋体" w:hAnsi="宋体" w:eastAsia="宋体"/>
-          <w:b/>
-          <w:sz w:val="24"/>
-        </w:rPr>
-        <w:t>二、关于应用价值和就业前景的理解</w:t>
+        <w:t>我对分布式处理的印象也比较深。之前写程序，大多数时候都是默认一台电脑完成全部任务。学到 HDFS 和 MapReduce 后，我才知道大数据处理更强调把任务拆开。数据分块存储，计算也分成很多小任务，最后再汇总。这个思路不只是技术上的安排，对我理解复杂问题也有帮助。一个问题太大时，先拆开，比一上来硬做要清楚很多。</w:t>
       </w:r>
     </w:p>
     <w:p>
@@ -547,7 +534,20 @@
           <w:b w:val="0"/>
           <w:sz w:val="24"/>
         </w:rPr>
-        <w:t>这门课也让我感觉到，大数据离生活其实不远。平时刷购物平台、短视频、地图导航，背后都有数据在发挥作用。比如平台会根据浏览和购买记录做推荐，交通系统会根据实时路况调整路线，金融行业会通过异常交易来判断风险。这些例子以前我也听过，但学习之后再看，会更清楚它们不是凭空“智能”，而是很多数据被持续记录、整理和计算后的结果。</w:t>
+        <w:t>不过我现在对这些技术也只是入门理解。像 Hadoop 生态里还有很多组件，我能说出大概作用，但还不能很熟练地搭建和调优。这个地方也是我后面需要补的。至少通过这门课，我知道了大数据处理不是一个单独的软件，而是一整套流程和思维方式。</w:t>
+      </w:r>
+    </w:p>
+    <w:p>
+      <w:pPr>
+        <w:spacing w:line="360" w:lineRule="auto" w:before="160" w:after="40"/>
+      </w:pPr>
+      <w:r>
+        <w:rPr>
+          <w:rFonts w:ascii="宋体" w:hAnsi="宋体" w:eastAsia="宋体"/>
+          <w:b/>
+          <w:sz w:val="24"/>
+        </w:rPr>
+        <w:t>二、对应用价值和就业前景的理解</w:t>
       </w:r>
     </w:p>
     <w:p>
@@ -561,7 +561,7 @@
           <w:b w:val="0"/>
           <w:sz w:val="24"/>
         </w:rPr>
-        <w:t>我理解的大数据价值，首先是让判断更有依据。过去很多事情可能靠经验判断，现在可以用数据去发现趋势。比如用户为什么流失、某个商品为什么卖得好、设备什么时候可能出问题，都可以从数据里找线索。当然，数据也不是万能的。如果只看数字，不结合具体场景，也可能得出片面的结论。所以我觉得大数据的价值不只是“算得快”，还在于能帮助人把问题看得更细。</w:t>
+        <w:t>学这门课之前，我觉得大数据应用离自己有点远，好像是互联网公司或者大型企业才会用。后来发现，其实平时生活里到处都有。购物平台推荐商品，地图软件判断拥堵，短视频平台推荐内容，银行判断异常交易，这些背后都离不开数据。只是平时用的时候不会特别去想。</w:t>
       </w:r>
     </w:p>
     <w:p>
@@ -575,7 +575,35 @@
           <w:b w:val="0"/>
           <w:sz w:val="24"/>
         </w:rPr>
-        <w:t>从就业角度看，大数据方向的岗位比较多，但要求也没有我之前想得那么单一。数据开发更偏平台和流程，数据分析更强调业务理解和表达，算法相关岗位又需要更强的数学和编程基础。对我来说，这门课至少让我知道，如果以后想往这个方向靠，不能只停留在会用某一个软件或会写几行代码，还要把数据库、编程、统计分析和实际业务联系起来。否则做出来的结果可能只是“完成了作业”，很难真正解决问题。</w:t>
+        <w:t>我觉得大数据最大的价值，是让很多判断有了依据。以前可能靠经验说“这个商品可能受欢迎”，现在可以看浏览量、转化率、用户停留时间等数据。当然，数据也不能代替人做所有判断。比如推荐系统如果只盯着点击率，可能会让用户一直看到同一类内容；如果金融风控只看模型结果，也可能误伤正常用户。所以我觉得大数据应用不仅要追求效率，还要考虑场景和后果。</w:t>
+      </w:r>
+    </w:p>
+    <w:p>
+      <w:pPr>
+        <w:spacing w:line="360" w:lineRule="auto" w:before="0" w:after="0"/>
+        <w:ind w:firstLine="480"/>
+      </w:pPr>
+      <w:r>
+        <w:rPr>
+          <w:rFonts w:ascii="宋体" w:hAnsi="宋体" w:eastAsia="宋体"/>
+          <w:b w:val="0"/>
+          <w:sz w:val="24"/>
+        </w:rPr>
+        <w:t>从就业角度看，大数据相关岗位确实不少，但我也意识到它不是学完一门课就能胜任的。数据开发需要会数据库、编程和平台工具；数据分析要能看懂业务，不能只会画图；算法岗位要求更高，还要有数学和模型基础。对我来说，这门课更像是打开了一个入口，让我知道以后如果想往这个方向走，应该继续补哪些能力。</w:t>
+      </w:r>
+    </w:p>
+    <w:p>
+      <w:pPr>
+        <w:spacing w:line="360" w:lineRule="auto" w:before="0" w:after="0"/>
+        <w:ind w:firstLine="480"/>
+      </w:pPr>
+      <w:r>
+        <w:rPr>
+          <w:rFonts w:ascii="宋体" w:hAnsi="宋体" w:eastAsia="宋体"/>
+          <w:b w:val="0"/>
+          <w:sz w:val="24"/>
+        </w:rPr>
+        <w:t>还有一点我以前没太注意，就是表达能力也很重要。数据处理完以后，如果不能把结果讲清楚，别人也很难相信或者使用这个结果。以后不管是做作业还是做项目，我都应该多想一步：这个结果说明了什么，有没有可能解释错，能不能让别人看懂。</w:t>
       </w:r>
     </w:p>
     <w:p>
@@ -602,7 +630,7 @@
           <w:b w:val="0"/>
           <w:sz w:val="24"/>
         </w:rPr>
-        <w:t>这学期学习下来，我最大的变化是处理数据时比以前更有顺序了。以前拿到数据，我经常直接开始写代码，出了问题再一处一处改。现在我会先看字段、数据类型、缺失情况，再想清楚自己到底要统计什么。这个习惯看起来很小，但对我帮助挺大，至少不会一开始就陷进报错里。</w:t>
+        <w:t>这学期最大的收获，是我处理数据时比以前有顺序了。以前拿到数据就急着写代码，觉得先跑起来再说。现在我会先看字段、类型、缺失值和重复记录。这个习惯虽然很普通，但能少走很多弯路。有时候问题不在代码，而在数据本身。</w:t>
       </w:r>
     </w:p>
     <w:p>
@@ -616,7 +644,7 @@
           <w:b w:val="0"/>
           <w:sz w:val="24"/>
         </w:rPr>
-        <w:t>课程中我也发现自己基础还不够扎实。比如有些命令或者环境配置，老师演示的时候看着不难，自己操作就容易卡住。有时候一个路径写错、一个文件名没对上，就会浪费很久。以前遇到这种情况我会有点着急，现在会先从最简单的地方查：文件在不在、字段名对不对、数据格式有没有问题。虽然排错过程不算轻松，但确实比盲目改代码有效。</w:t>
+        <w:t>我记得做练习时，有一次只是想统计数量，结果算出来明显偏大。后来检查才发现有重复记录没有处理。那次以后我对“程序能运行”和“结果可信”这两件事分得更清楚了。程序没有报错，只能说明语法和运行环境暂时没问题，并不能说明分析就对。</w:t>
       </w:r>
     </w:p>
     <w:p>
@@ -630,7 +658,7 @@
           <w:b w:val="0"/>
           <w:sz w:val="24"/>
         </w:rPr>
-        <w:t>还有一次让我印象比较深的是，明明只是想做一个简单统计，但前面因为没有先检查重复记录，结果算出来的数量明显偏大。那时候我才发现，数据处理里很多错误不是语法错误，而是逻辑上没有想周全。程序能运行，只能说明它没有在语法上失败，不能说明分析结果就可信。</w:t>
+        <w:t>还有一些基础问题也暴露出来。比如路径写错、文件名没对应、编码不一致，这些小问题都可能让程序跑不起来。刚开始遇到报错我会比较急，后来慢慢学会先看报错信息，再检查文件位置、字段名和数据格式。虽然这个过程有点慢，但比乱改代码有效。</w:t>
       </w:r>
     </w:p>
     <w:p>
@@ -644,7 +672,7 @@
           <w:b w:val="0"/>
           <w:sz w:val="24"/>
         </w:rPr>
-        <w:t>我还慢慢认识到，数据分析不是只给出一个结果就行，还要能解释结果。比如同样是统计用户活跃度，按登录次数算和按实际使用时长算，得到的结论可能不一样。这个指标为什么这样定义、是否合理、有没有遗漏，这些都需要自己判断。也就是说，大数据技术看起来很偏技术，但背后其实也需要责任感。不能因为结果是计算机算出来的，就默认它一定正确。</w:t>
+        <w:t>我也开始意识到，数据分析里面有很多主观选择。比如什么算活跃用户，用登录次数算，还是用使用时长算，结论可能不一样。指标怎么定，异常值删不删，缺失值怎么补，这些都不是机械操作。做数据的人如果不认真，结果看起来很客观，其实可能已经带了偏差。</w:t>
       </w:r>
     </w:p>
     <w:p>
@@ -658,7 +686,7 @@
           <w:b w:val="0"/>
           <w:sz w:val="24"/>
         </w:rPr>
-        <w:t>当然，我还有一些问题没有完全想明白。比如真实企业里的数据肯定比课堂样例复杂得多，数据安全和隐私到底怎么保证？如果数据分析结果和人的经验判断不一致，应该相信哪一边？不同的大数据框架在实际项目里又该怎么选？这些问题现在我还只能有一个大概认识，后面还需要通过项目和案例继续学习。</w:t>
+        <w:t>这也让我反思自己以前写总结或者做实验报告时，常常只写最后结果，很少写中间判断。现在再看，过程其实也很重要。为什么这样处理数据，为什么选择这个指标，哪里可能不准确，这些内容写出来，反而能说明自己真的理解了。</w:t>
       </w:r>
     </w:p>
     <w:p>
@@ -672,7 +700,21 @@
           <w:b w:val="0"/>
           <w:sz w:val="24"/>
         </w:rPr>
-        <w:t>总体来说，《大数据处理与实践》这门课让我不只是知道了几个概念或工具，更重要的是让我开始用数据处理的方式去看问题。以后无论是不是从事大数据相关工作，我觉得这种思维都很有用：先弄清楚问题，再整理数据，用结果支撑判断，同时也对结果保持怀疑和检查。对我来说，这就是这门课最大的收获。</w:t>
+        <w:t>目前我还有一些困惑。真实企业里的数据肯定比课堂数据复杂得多，数据安全和隐私怎么保证？模型算出来的结果如果和人的经验不一样，应该怎么判断？还有那么多大数据框架，实际项目里到底怎么选？这些问题我现在还没有答案，只能说有了一个方向。</w:t>
+      </w:r>
+    </w:p>
+    <w:p>
+      <w:pPr>
+        <w:spacing w:line="360" w:lineRule="auto" w:before="0" w:after="0"/>
+        <w:ind w:firstLine="480"/>
+      </w:pPr>
+      <w:r>
+        <w:rPr>
+          <w:rFonts w:ascii="宋体" w:hAnsi="宋体" w:eastAsia="宋体"/>
+          <w:b w:val="0"/>
+          <w:sz w:val="24"/>
+        </w:rPr>
+        <w:t>总的来说，这门课让我对大数据有了比较实际的认识。它不是只讲概念，也不是简单运行工具，而是从数据到结果的一整套过程。以后即使我不一定直接做大数据岗位，这种先整理信息、再分析问题、最后谨慎解释结果的思路，对学习和工作应该都有帮助。</w:t>
       </w:r>
     </w:p>
     <w:sectPr>

</xml_diff>

<commit_message>
vault backup: 2026-05-06 21:45:13
</commit_message>
<xml_diff>
--- a/学校事务/大数据/课程总结/12303070250黄彬.docx
+++ b/学校事务/大数据/课程总结/12303070250黄彬.docx
@@ -492,7 +492,7 @@
           <w:b w:val="0"/>
           <w:sz w:val="24"/>
         </w:rPr>
-        <w:t>这门课刚开始的时候，我对大数据的理解其实挺模糊。听到“大数据”三个字，第一反应就是数据特别多，可能电脑配置要好一点，程序跑得久一点。后来学到数据采集、存储、清洗和计算这些内容，我才发现它不是简单把很多数据放在一起。真正麻烦的地方，是数据又多又乱，而且很多时候并不是拿来就能用。</w:t>
+        <w:t>这门课学到现在，我对“大数据”的理解和刚开课时不太一样。开头我以为它就是数据量很大，最多再加上服务器多一点。后来发现这个说法太粗了。课堂里反复出现的不是“多”一个字，而是数据从哪里来、怎么存、脏数据怎么处理、最后算出来的东西能不能信。</w:t>
       </w:r>
     </w:p>
     <w:p>
@@ -506,7 +506,7 @@
           <w:b w:val="0"/>
           <w:sz w:val="24"/>
         </w:rPr>
-        <w:t>比如一份表里，字段名可能不统一，有的地方空着，有的记录重复，还有一些值看起来就不太合理。以前我看到这种情况，会想着先把代码写出来再说。但现在回头看，如果前面没处理好，后面算出来的结果很可能是偏的。课堂上讲到数据预处理时，我一开始觉得这一块有点琐碎，后来做练习才发现，它反而是最容易出问题的地方。</w:t>
+        <w:t>我以前写小程序，数据一般都是老师给好的，表格也比较规整，所以不会太在意前面的整理过程。学到数据清洗以后才发现，现实一点的数据经常不听话：有空值，有重复，有些字段写法还不统一。这个时候如果直接统计，结果看着像是对的，其实可能已经错了。这个印象比某个具体命令更深。</w:t>
       </w:r>
     </w:p>
     <w:p>
@@ -520,7 +520,7 @@
           <w:b w:val="0"/>
           <w:sz w:val="24"/>
         </w:rPr>
-        <w:t>我对分布式处理的印象也比较深。之前写程序，大多数时候都是默认一台电脑完成全部任务。学到 HDFS 和 MapReduce 后，我才知道大数据处理更强调把任务拆开。数据分块存储，计算也分成很多小任务，最后再汇总。这个思路不只是技术上的安排，对我理解复杂问题也有帮助。一个问题太大时，先拆开，比一上来硬做要清楚很多。</w:t>
+        <w:t>HDFS 和 MapReduce 这一块，我一开始理解得比较慢。尤其是 Map 和 Reduce，刚听的时候觉得像是在绕概念。后来把它想成“先分开做小账，再把小账合起来”，就顺一点了。大数据处理不是让一台电脑从头做到尾，而是把任务拆给很多节点，这个思想我觉得挺重要。</w:t>
       </w:r>
     </w:p>
     <w:p>
@@ -534,7 +534,7 @@
           <w:b w:val="0"/>
           <w:sz w:val="24"/>
         </w:rPr>
-        <w:t>不过我现在对这些技术也只是入门理解。像 Hadoop 生态里还有很多组件，我能说出大概作用，但还不能很熟练地搭建和调优。这个地方也是我后面需要补的。至少通过这门课，我知道了大数据处理不是一个单独的软件，而是一整套流程和思维方式。</w:t>
+        <w:t>现在让我完整讲 Hadoop 生态，我肯定还讲不细，但至少知道大数据不是某一个软件名。它更像一条链子：前面数据质量差，后面分析就站不稳；中间计算设计不好，效率也会拖下来。以前我只关心代码能不能跑，现在会多想一步，数据本身有没有问题。</w:t>
       </w:r>
     </w:p>
     <w:p>
@@ -561,7 +561,7 @@
           <w:b w:val="0"/>
           <w:sz w:val="24"/>
         </w:rPr>
-        <w:t>学这门课之前，我觉得大数据应用离自己有点远，好像是互联网公司或者大型企业才会用。后来发现，其实平时生活里到处都有。购物平台推荐商品，地图软件判断拥堵，短视频平台推荐内容，银行判断异常交易，这些背后都离不开数据。只是平时用的时候不会特别去想。</w:t>
+        <w:t>大数据应用以前对我来说有点像新闻里的词。学完一些案例后再看，才发现它其实就在日常生活里。比如购物软件推荐商品，地图显示拥堵，短视频一直推类似内容，这些都不是随机发生的，背后都在收集和分析用户行为。</w:t>
       </w:r>
     </w:p>
     <w:p>
@@ -575,7 +575,7 @@
           <w:b w:val="0"/>
           <w:sz w:val="24"/>
         </w:rPr>
-        <w:t>我觉得大数据最大的价值，是让很多判断有了依据。以前可能靠经验说“这个商品可能受欢迎”，现在可以看浏览量、转化率、用户停留时间等数据。当然，数据也不能代替人做所有判断。比如推荐系统如果只盯着点击率，可能会让用户一直看到同一类内容；如果金融风控只看模型结果，也可能误伤正常用户。所以我觉得大数据应用不仅要追求效率，还要考虑场景和后果。</w:t>
+        <w:t>我觉得它的价值不是简单地“让机器更聪明”，而是让很多判断有依据。商家可以看销量和用户停留时间，学校或企业可以看一些运行数据，交通系统也能根据实时情况调整。但这里面也有问题。数据多不代表一定判断准，如果指标选错了，反而会把人带偏。</w:t>
       </w:r>
     </w:p>
     <w:p>
@@ -589,7 +589,7 @@
           <w:b w:val="0"/>
           <w:sz w:val="24"/>
         </w:rPr>
-        <w:t>从就业角度看，大数据相关岗位确实不少，但我也意识到它不是学完一门课就能胜任的。数据开发需要会数据库、编程和平台工具；数据分析要能看懂业务，不能只会画图；算法岗位要求更高，还要有数学和模型基础。对我来说，这门课更像是打开了一个入口，让我知道以后如果想往这个方向走，应该继续补哪些能力。</w:t>
+        <w:t>就业方面，我原来只知道“数据分析师”这个名字，现在才知道里面还分很多方向。有的人做数据采集和平台，有的人做清洗和仓库，有的人负责分析报告，还有人做算法模型。每个方向听起来都和数据有关，但要学的东西并不一样。</w:t>
       </w:r>
     </w:p>
     <w:p>
@@ -603,7 +603,7 @@
           <w:b w:val="0"/>
           <w:sz w:val="24"/>
         </w:rPr>
-        <w:t>还有一点我以前没太注意，就是表达能力也很重要。数据处理完以后，如果不能把结果讲清楚，别人也很难相信或者使用这个结果。以后不管是做作业还是做项目，我都应该多想一步：这个结果说明了什么，有没有可能解释错，能不能让别人看懂。</w:t>
+        <w:t>如果以后真想靠近这个方向，我感觉自己还差不少。编程要更熟，数据库要补，统计知识也不能只停留在会算平均数。还有表达能力也重要。分析做完，如果说不清为什么这样算、结果说明什么，那别人也很难使用。这个问题以前我没怎么想过。</w:t>
       </w:r>
     </w:p>
     <w:p>
@@ -630,7 +630,7 @@
           <w:b w:val="0"/>
           <w:sz w:val="24"/>
         </w:rPr>
-        <w:t>这学期最大的收获，是我处理数据时比以前有顺序了。以前拿到数据就急着写代码，觉得先跑起来再说。现在我会先看字段、类型、缺失值和重复记录。这个习惯虽然很普通，但能少走很多弯路。有时候问题不在代码，而在数据本身。</w:t>
+        <w:t>这门课对我最大的改变，是做数据相关作业时不再那么急。以前一拿到文件就想写代码，觉得先跑出来再说。现在会先打开看一眼字段，看看有没有空值、重复值，数据类型是不是正常。这个步骤不难，但真的能少踩坑。</w:t>
       </w:r>
     </w:p>
     <w:p>
@@ -644,7 +644,7 @@
           <w:b w:val="0"/>
           <w:sz w:val="24"/>
         </w:rPr>
-        <w:t>我记得做练习时，有一次只是想统计数量，结果算出来明显偏大。后来检查才发现有重复记录没有处理。那次以后我对“程序能运行”和“结果可信”这两件事分得更清楚了。程序没有报错，只能说明语法和运行环境暂时没问题，并不能说明分析就对。</w:t>
+        <w:t>有一次做统计，我一开始算出来的数量明显不对，但程序没有报错。我当时还以为是公式写错了，后来发现是重复记录没有处理。这个经历让我记住一件事：程序跑通和结果正确不是一回事。尤其是数据处理，错不一定会以红色报错的形式出现。</w:t>
       </w:r>
     </w:p>
     <w:p>
@@ -658,7 +658,7 @@
           <w:b w:val="0"/>
           <w:sz w:val="24"/>
         </w:rPr>
-        <w:t>还有一些基础问题也暴露出来。比如路径写错、文件名没对应、编码不一致，这些小问题都可能让程序跑不起来。刚开始遇到报错我会比较急，后来慢慢学会先看报错信息，再检查文件位置、字段名和数据格式。虽然这个过程有点慢，但比乱改代码有效。</w:t>
+        <w:t>我也发现自己排错能力还要练。路径、文件名、编码这些看着小，其实很容易卡住。刚开始遇到报错我会乱改，改到最后自己也不知道改了哪里。后来慢慢学会先看报错信息，再一步一步检查。这个过程有点笨，但比凭感觉改靠谱。</w:t>
       </w:r>
     </w:p>
     <w:p>
@@ -672,7 +672,7 @@
           <w:b w:val="0"/>
           <w:sz w:val="24"/>
         </w:rPr>
-        <w:t>我也开始意识到，数据分析里面有很多主观选择。比如什么算活跃用户，用登录次数算，还是用使用时长算，结论可能不一样。指标怎么定，异常值删不删，缺失值怎么补，这些都不是机械操作。做数据的人如果不认真，结果看起来很客观，其实可能已经带了偏差。</w:t>
+        <w:t>另外，我对指标的理解也变了。以前觉得统计结果就是客观的，现在知道中间有很多选择。比如活跃用户怎么定义，是登录一次就算，还是要有实际操作？缺失值是删掉还是补上？这些选择都会影响最后结论。数据看起来冷冰冰，但处理数据的人其实一直在做判断。</w:t>
       </w:r>
     </w:p>
     <w:p>
@@ -686,7 +686,7 @@
           <w:b w:val="0"/>
           <w:sz w:val="24"/>
         </w:rPr>
-        <w:t>这也让我反思自己以前写总结或者做实验报告时，常常只写最后结果，很少写中间判断。现在再看，过程其实也很重要。为什么这样处理数据，为什么选择这个指标，哪里可能不准确，这些内容写出来，反而能说明自己真的理解了。</w:t>
+        <w:t>现在还有些问题我没想明白。课堂上的数据相对简单，真实项目里数据来源多、权限复杂，还涉及隐私保护，肯定麻烦很多。还有不同框架怎么选，什么时候用 Hadoop，什么时候用 Spark，这些我现在只能有个大概印象。</w:t>
       </w:r>
     </w:p>
     <w:p>
@@ -700,21 +700,7 @@
           <w:b w:val="0"/>
           <w:sz w:val="24"/>
         </w:rPr>
-        <w:t>目前我还有一些困惑。真实企业里的数据肯定比课堂数据复杂得多，数据安全和隐私怎么保证？模型算出来的结果如果和人的经验不一样，应该怎么判断？还有那么多大数据框架，实际项目里到底怎么选？这些问题我现在还没有答案，只能说有了一个方向。</w:t>
-      </w:r>
-    </w:p>
-    <w:p>
-      <w:pPr>
-        <w:spacing w:line="360" w:lineRule="auto" w:before="0" w:after="0"/>
-        <w:ind w:firstLine="480"/>
-      </w:pPr>
-      <w:r>
-        <w:rPr>
-          <w:rFonts w:ascii="宋体" w:hAnsi="宋体" w:eastAsia="宋体"/>
-          <w:b w:val="0"/>
-          <w:sz w:val="24"/>
-        </w:rPr>
-        <w:t>总的来说，这门课让我对大数据有了比较实际的认识。它不是只讲概念，也不是简单运行工具，而是从数据到结果的一整套过程。以后即使我不一定直接做大数据岗位，这种先整理信息、再分析问题、最后谨慎解释结果的思路，对学习和工作应该都有帮助。</w:t>
+        <w:t>写这份总结时，我也重新想了一下这门课的意义。它没有让我一下子变成会做大数据项目的人，但让我知道数据处理不是点几下工具，也不是复制一段代码。以后不管做什么方向，遇到问题先看数据、再分析原因、最后谨慎下结论，这个习惯应该是有用的。</w:t>
       </w:r>
     </w:p>
     <w:sectPr>

</xml_diff>

<commit_message>
vault backup: 2026-05-06 21:47:28
</commit_message>
<xml_diff>
--- a/学校事务/大数据/课程总结/12303070250黄彬.docx
+++ b/学校事务/大数据/课程总结/12303070250黄彬.docx
@@ -672,6 +672,20 @@
           <w:b w:val="0"/>
           <w:sz w:val="24"/>
         </w:rPr>
+        <w:t>还有一个收获是，我开始愿意把中间过程写下来。以前做实验报告，总想直接写结果，觉得过程不重要。现在发现，数据从原始文件到最后结论，中间每一步都可能影响结果。比如为什么删重复，为什么保留某些字段，为什么不用另一个统计方式，这些如果不写清楚，别人其实很难判断我的结论是不是可靠。</w:t>
+      </w:r>
+    </w:p>
+    <w:p>
+      <w:pPr>
+        <w:spacing w:line="360" w:lineRule="auto" w:before="0" w:after="0"/>
+        <w:ind w:firstLine="480"/>
+      </w:pPr>
+      <w:r>
+        <w:rPr>
+          <w:rFonts w:ascii="宋体" w:hAnsi="宋体" w:eastAsia="宋体"/>
+          <w:b w:val="0"/>
+          <w:sz w:val="24"/>
+        </w:rPr>
         <w:t>另外，我对指标的理解也变了。以前觉得统计结果就是客观的，现在知道中间有很多选择。比如活跃用户怎么定义，是登录一次就算，还是要有实际操作？缺失值是删掉还是补上？这些选择都会影响最后结论。数据看起来冷冰冰，但处理数据的人其实一直在做判断。</w:t>
       </w:r>
     </w:p>
@@ -687,6 +701,20 @@
           <w:sz w:val="24"/>
         </w:rPr>
         <w:t>现在还有些问题我没想明白。课堂上的数据相对简单，真实项目里数据来源多、权限复杂，还涉及隐私保护，肯定麻烦很多。还有不同框架怎么选，什么时候用 Hadoop，什么时候用 Spark，这些我现在只能有个大概印象。</w:t>
+      </w:r>
+    </w:p>
+    <w:p>
+      <w:pPr>
+        <w:spacing w:line="360" w:lineRule="auto" w:before="0" w:after="0"/>
+        <w:ind w:firstLine="480"/>
+      </w:pPr>
+      <w:r>
+        <w:rPr>
+          <w:rFonts w:ascii="宋体" w:hAnsi="宋体" w:eastAsia="宋体"/>
+          <w:b w:val="0"/>
+          <w:sz w:val="24"/>
+        </w:rPr>
+        <w:t>后面如果还有机会继续学，我想先把基础工具练熟一点。至少遇到数据表、日志文件或者简单的统计任务时，能自己把流程走完整，而不是只照着步骤做。这样再去理解更大的平台和框架，可能会更踏实。</w:t>
       </w:r>
     </w:p>
     <w:p>

</xml_diff>

<commit_message>
vault backup: 2026-05-06 22:01:50
</commit_message>
<xml_diff>
--- a/学校事务/大数据/课程总结/12303070250黄彬.docx
+++ b/学校事务/大数据/课程总结/12303070250黄彬.docx
@@ -210,7 +210,7 @@
                 <w:b w:val="0"/>
                 <w:sz w:val="24"/>
               </w:rPr>
-              <w:t>【请填写班级】</w:t>
+              <w:t>123030701</w:t>
             </w:r>
           </w:p>
         </w:tc>
@@ -443,7 +443,7 @@
                 <w:b w:val="0"/>
                 <w:sz w:val="24"/>
               </w:rPr>
-              <w:t>2025年  月   日</w:t>
+              <w:t>2025年  5月   6日</w:t>
             </w:r>
           </w:p>
         </w:tc>
@@ -492,7 +492,7 @@
           <w:b w:val="0"/>
           <w:sz w:val="24"/>
         </w:rPr>
-        <w:t>这门课学到现在，我对“大数据”的理解和刚开课时不太一样。开头我以为它就是数据量很大，最多再加上服务器多一点。后来发现这个说法太粗了。课堂里反复出现的不是“多”一个字，而是数据从哪里来、怎么存、脏数据怎么处理、最后算出来的东西能不能信。</w:t>
+        <w:t>这门课学到后面，我对“大数据”的理解比刚开始具体了很多。以前听到这个词，更多想到的是数据量大、服务器多。真正做过 Hadoop、HDFS、Spark 和 Scala 的实验之后，我才发现，大数据技术不是一个很空的概念，而是一套把数据放进去、管起来、算出来的流程。</w:t>
       </w:r>
     </w:p>
     <w:p>
@@ -506,7 +506,7 @@
           <w:b w:val="0"/>
           <w:sz w:val="24"/>
         </w:rPr>
-        <w:t>我以前写小程序，数据一般都是老师给好的，表格也比较规整，所以不会太在意前面的整理过程。学到数据清洗以后才发现，现实一点的数据经常不听话：有空值，有重复，有些字段写法还不统一。这个时候如果直接统计，结果看着像是对的，其实可能已经错了。这个印象比某个具体命令更深。</w:t>
+        <w:t>HDFS 给我的印象最直接。以前文件就是放在本地文件夹里，复制、删除、查看都很直观。做 HDFS Shell 命令实验时，要用命令把文件上传到分布式文件系统里，再去查看目录、移动文件、删除文件。刚开始会觉得麻烦，后来才明白它强调的是分布式存储：文件不只是存在某一个地方，而是按块存放，并且要考虑副本和可靠性。</w:t>
       </w:r>
     </w:p>
     <w:p>
@@ -520,7 +520,7 @@
           <w:b w:val="0"/>
           <w:sz w:val="24"/>
         </w:rPr>
-        <w:t>HDFS 和 MapReduce 这一块，我一开始理解得比较慢。尤其是 Map 和 Reduce，刚听的时候觉得像是在绕概念。后来把它想成“先分开做小账，再把小账合起来”，就顺一点了。大数据处理不是让一台电脑从头做到尾，而是把任务拆给很多节点，这个思想我觉得挺重要。</w:t>
+        <w:t>Hadoop 实验让我理解了“大任务拆开做”的意思。课堂上讲 MapReduce 时，我一开始只是记住了 Map 和 Reduce 两个名字，真正做实验时才知道它不是单纯换一种写法，而是把数据先分散处理，再把结果合并。这个过程让我对分布式计算有了比较实在的感觉，不再只是书上的流程图。</w:t>
       </w:r>
     </w:p>
     <w:p>
@@ -534,7 +534,21 @@
           <w:b w:val="0"/>
           <w:sz w:val="24"/>
         </w:rPr>
-        <w:t>现在让我完整讲 Hadoop 生态，我肯定还讲不细，但至少知道大数据不是某一个软件名。它更像一条链子：前面数据质量差，后面分析就站不稳；中间计算设计不好，效率也会拖下来。以前我只关心代码能不能跑，现在会多想一步，数据本身有没有问题。</w:t>
+        <w:t>Spark 和 Scala 的实验对我来说难度更高一点。Scala 语法和以前接触的语言不太一样，写起来一开始不顺手。Spark 里 RDD 或 DataFrame 这些操作，也不是看一遍就能完全理解。可是在实验里把数据读进来、转换、过滤、统计之后，我能感觉到 Spark 更适合做内存计算，处理流程也比单纯理解概念时清楚得多。</w:t>
+      </w:r>
+    </w:p>
+    <w:p>
+      <w:pPr>
+        <w:spacing w:line="360" w:lineRule="auto" w:before="0" w:after="0"/>
+        <w:ind w:firstLine="480"/>
+      </w:pPr>
+      <w:r>
+        <w:rPr>
+          <w:rFonts w:ascii="宋体" w:hAnsi="宋体" w:eastAsia="宋体"/>
+          <w:b w:val="0"/>
+          <w:sz w:val="24"/>
+        </w:rPr>
+        <w:t>所以现在再看大数据技术，我觉得重点不只是“会不会用某个命令”，而是能不能理解数据在系统里怎么流动。数据从普通文件进入 HDFS，再通过 Hadoop 或 Spark 做计算，最后得到结果。中间任何一步没弄清楚，后面都会卡住。</w:t>
       </w:r>
     </w:p>
     <w:p>
@@ -561,7 +575,7 @@
           <w:b w:val="0"/>
           <w:sz w:val="24"/>
         </w:rPr>
-        <w:t>大数据应用以前对我来说有点像新闻里的词。学完一些案例后再看，才发现它其实就在日常生活里。比如购物软件推荐商品，地图显示拥堵，短视频一直推类似内容，这些都不是随机发生的，背后都在收集和分析用户行为。</w:t>
+        <w:t>学这些内容以后，我再看一些大数据应用，会比以前多想一层。比如购物推荐、交通拥堵分析、日志统计、用户行为分析，这些应用背后都需要类似的处理流程。先有大量数据，再有可靠存储，然后通过计算框架把结果算出来。以前我只看到最后的推荐或图表，现在会想到后面其实有 HDFS、计算框架、数据库和程序在配合。</w:t>
       </w:r>
     </w:p>
     <w:p>
@@ -575,7 +589,7 @@
           <w:b w:val="0"/>
           <w:sz w:val="24"/>
         </w:rPr>
-        <w:t>我觉得它的价值不是简单地“让机器更聪明”，而是让很多判断有依据。商家可以看销量和用户停留时间，学校或企业可以看一些运行数据，交通系统也能根据实时情况调整。但这里面也有问题。数据多不代表一定判断准，如果指标选错了，反而会把人带偏。</w:t>
+        <w:t>我觉得大数据的价值，一方面是把以前很难处理的大量数据用起来，另一方面是让决策更有依据。比如企业可以根据用户行为调整服务，平台可以分析访问日志，交通系统也可以根据数据判断拥堵情况。数据多了以后，靠人工一点点看肯定不现实，这时候分布式存储和计算就很重要。</w:t>
       </w:r>
     </w:p>
     <w:p>
@@ -589,7 +603,7 @@
           <w:b w:val="0"/>
           <w:sz w:val="24"/>
         </w:rPr>
-        <w:t>就业方面，我原来只知道“数据分析师”这个名字，现在才知道里面还分很多方向。有的人做数据采集和平台，有的人做清洗和仓库，有的人负责分析报告，还有人做算法模型。每个方向听起来都和数据有关，但要学的东西并不一样。</w:t>
+        <w:t>但是这门课也让我意识到，数据分析不是只要有工具就行。指标怎么定、数据有没有缺失、结果是不是被重复记录影响，这些都要人来判断。Spark 算得快，Hadoop 能处理大数据，但如果前面数据理解错了，最后结果还是会偏。工具解决的是效率问题，人要负责判断问题。</w:t>
       </w:r>
     </w:p>
     <w:p>
@@ -603,7 +617,21 @@
           <w:b w:val="0"/>
           <w:sz w:val="24"/>
         </w:rPr>
-        <w:t>如果以后真想靠近这个方向，我感觉自己还差不少。编程要更熟，数据库要补，统计知识也不能只停留在会算平均数。还有表达能力也重要。分析做完，如果说不清为什么这样算、结果说明什么，那别人也很难使用。这个问题以前我没怎么想过。</w:t>
+        <w:t>就业方面，我以前只知道数据分析师、程序员这些比较笼统的说法。现在知道大数据方向其实分得比较细，有做 Hadoop 平台和集群的，有做 HDFS、Hive、Spark 这类数据处理的，也有用 Scala 或 Python 写分析程序的。不同岗位需要的能力不一样，但编程、数据库、Linux 命令、数据理解这些基础应该都绕不开。</w:t>
+      </w:r>
+    </w:p>
+    <w:p>
+      <w:pPr>
+        <w:spacing w:line="360" w:lineRule="auto" w:before="0" w:after="0"/>
+        <w:ind w:firstLine="480"/>
+      </w:pPr>
+      <w:r>
+        <w:rPr>
+          <w:rFonts w:ascii="宋体" w:hAnsi="宋体" w:eastAsia="宋体"/>
+          <w:b w:val="0"/>
+          <w:sz w:val="24"/>
+        </w:rPr>
+        <w:t>对我来说，这门课更像是帮我认清了自己还差什么。Scala 还不熟，Spark 的一些转换和行动操作也容易混，HDFS 命令如果隔一段时间不用也会忘。以后如果想继续学这个方向，不能只看概念，还是要多做实验，把命令和流程真正跑一遍。</w:t>
       </w:r>
     </w:p>
     <w:p>
@@ -630,7 +658,7 @@
           <w:b w:val="0"/>
           <w:sz w:val="24"/>
         </w:rPr>
-        <w:t>这门课对我最大的改变，是做数据相关作业时不再那么急。以前一拿到文件就想写代码，觉得先跑出来再说。现在会先打开看一眼字段，看看有没有空值、重复值，数据类型是不是正常。这个步骤不难，但真的能少踩坑。</w:t>
+        <w:t>这门课最大的收获，是让我从“听懂概念”慢慢转到“动手验证”。Hadoop、HDFS、Spark、Scala 这些词，如果只是写在笔记里，看起来都能理解。但真正做实验时，路径写错、文件没上传、命令顺序不对，都会让任务跑不起来。这个过程虽然有点折腾，但也让我记得更牢。</w:t>
       </w:r>
     </w:p>
     <w:p>
@@ -644,7 +672,7 @@
           <w:b w:val="0"/>
           <w:sz w:val="24"/>
         </w:rPr>
-        <w:t>有一次做统计，我一开始算出来的数量明显不对，但程序没有报错。我当时还以为是公式写错了，后来发现是重复记录没有处理。这个经历让我记住一件事：程序跑通和结果正确不是一回事。尤其是数据处理，错不一定会以红色报错的形式出现。</w:t>
+        <w:t>我印象比较深的是 HDFS Shell 常用命令。上传文件、查看目录、删除文件这些操作，表面上和普通文件管理差不多，但放到 HDFS 里就多了一层分布式系统的背景。刚开始我只是照着指令敲，后来才慢慢明白，每一步其实都是在和集群里的文件系统交互。</w:t>
       </w:r>
     </w:p>
     <w:p>
@@ -658,7 +686,7 @@
           <w:b w:val="0"/>
           <w:sz w:val="24"/>
         </w:rPr>
-        <w:t>我也发现自己排错能力还要练。路径、文件名、编码这些看着小，其实很容易卡住。刚开始遇到报错我会乱改，改到最后自己也不知道改了哪里。后来慢慢学会先看报错信息，再一步一步检查。这个过程有点笨，但比凭感觉改靠谱。</w:t>
+        <w:t>Spark 实验让我意识到自己编程基础还要加强。Scala 语言的写法有些地方不太习惯，尤其是函数式写法和集合操作，刚开始容易看不懂。做统计或转换时，如果前面数据结构没想清楚，后面代码就会越写越乱。以后还是要把基础语法和常用 API 多练几遍。</w:t>
       </w:r>
     </w:p>
     <w:p>
@@ -672,7 +700,7 @@
           <w:b w:val="0"/>
           <w:sz w:val="24"/>
         </w:rPr>
-        <w:t>还有一个收获是，我开始愿意把中间过程写下来。以前做实验报告，总想直接写结果，觉得过程不重要。现在发现，数据从原始文件到最后结论，中间每一步都可能影响结果。比如为什么删重复，为什么保留某些字段，为什么不用另一个统计方式，这些如果不写清楚，别人其实很难判断我的结论是不是可靠。</w:t>
+        <w:t>我也发现，做大数据实验时不能只盯着最后结果。比如一个任务跑出来了，也要回头看输入文件是不是对的，路径是不是拿错了，统计口径是不是清楚。以前我做实验报告，常常只写结果，现在觉得中间过程更能说明问题。为什么这样上传，为什么这样转换，为什么得到这个统计结果，这些都应该写清楚。</w:t>
       </w:r>
     </w:p>
     <w:p>
@@ -686,7 +714,7 @@
           <w:b w:val="0"/>
           <w:sz w:val="24"/>
         </w:rPr>
-        <w:t>另外，我对指标的理解也变了。以前觉得统计结果就是客观的，现在知道中间有很多选择。比如活跃用户怎么定义，是登录一次就算，还是要有实际操作？缺失值是删掉还是补上？这些选择都会影响最后结论。数据看起来冷冰冰，但处理数据的人其实一直在做判断。</w:t>
+        <w:t>当然，还有一些困惑没有解决。课堂实验的数据规模比较有限，真实企业里的数据肯定更复杂，集群环境也不会像实验步骤那么顺利。Hadoop 和 Spark 到底在什么场景下选择，Scala 在实际项目里用得多不多，HDFS 的权限和数据安全怎么管理，这些我现在还只是有初步印象。</w:t>
       </w:r>
     </w:p>
     <w:p>
@@ -700,35 +728,7 @@
           <w:b w:val="0"/>
           <w:sz w:val="24"/>
         </w:rPr>
-        <w:t>现在还有些问题我没想明白。课堂上的数据相对简单，真实项目里数据来源多、权限复杂，还涉及隐私保护，肯定麻烦很多。还有不同框架怎么选，什么时候用 Hadoop，什么时候用 Spark，这些我现在只能有个大概印象。</w:t>
-      </w:r>
-    </w:p>
-    <w:p>
-      <w:pPr>
-        <w:spacing w:line="360" w:lineRule="auto" w:before="0" w:after="0"/>
-        <w:ind w:firstLine="480"/>
-      </w:pPr>
-      <w:r>
-        <w:rPr>
-          <w:rFonts w:ascii="宋体" w:hAnsi="宋体" w:eastAsia="宋体"/>
-          <w:b w:val="0"/>
-          <w:sz w:val="24"/>
-        </w:rPr>
-        <w:t>后面如果还有机会继续学，我想先把基础工具练熟一点。至少遇到数据表、日志文件或者简单的统计任务时，能自己把流程走完整，而不是只照着步骤做。这样再去理解更大的平台和框架，可能会更踏实。</w:t>
-      </w:r>
-    </w:p>
-    <w:p>
-      <w:pPr>
-        <w:spacing w:line="360" w:lineRule="auto" w:before="0" w:after="0"/>
-        <w:ind w:firstLine="480"/>
-      </w:pPr>
-      <w:r>
-        <w:rPr>
-          <w:rFonts w:ascii="宋体" w:hAnsi="宋体" w:eastAsia="宋体"/>
-          <w:b w:val="0"/>
-          <w:sz w:val="24"/>
-        </w:rPr>
-        <w:t>写这份总结时，我也重新想了一下这门课的意义。它没有让我一下子变成会做大数据项目的人，但让我知道数据处理不是点几下工具，也不是复制一段代码。以后不管做什么方向，遇到问题先看数据、再分析原因、最后谨慎下结论，这个习惯应该是有用的。</w:t>
+        <w:t>总的来说，这门课让我对大数据处理有了更具体的感觉。它不是单纯背概念，也不是只会几个命令，而是要理解存储、计算、语言和数据之间的关系。以后不管是否从事大数据岗位，至少我会更重视数据处理的过程，不会只看最后一个结果。</w:t>
       </w:r>
     </w:p>
     <w:sectPr>

</xml_diff>